<commit_message>
Updates are based on my run-through with the low performance luna model
</commit_message>
<xml_diff>
--- a/Design/AgentMD - Conversations/2026-08-27 Design Conversations.docx
+++ b/Design/AgentMD - Conversations/2026-08-27 Design Conversations.docx
@@ -33,43 +33,7 @@
           <w:sz w:val="22"/>
           <w:szCs w:val="22"/>
         </w:rPr>
-        <w:t xml:space="preserve">  &gt; rules I've told you about not modifying the source code in </w:t>
-      </w:r>
-      <w:proofErr w:type="spellStart"/>
-      <w:r>
-        <w:rPr>
-          <w:rFonts w:ascii="Calibri" w:hAnsi="Calibri" w:cs="Calibri"/>
-          <w:sz w:val="22"/>
-          <w:szCs w:val="22"/>
-        </w:rPr>
-        <w:t>llm</w:t>
-      </w:r>
-      <w:proofErr w:type="spellEnd"/>
-      <w:r>
-        <w:rPr>
-          <w:rFonts w:ascii="Calibri" w:hAnsi="Calibri" w:cs="Calibri"/>
-          <w:sz w:val="22"/>
-          <w:szCs w:val="22"/>
-        </w:rPr>
-        <w:t xml:space="preserve">-device, </w:t>
-      </w:r>
-      <w:proofErr w:type="spellStart"/>
-      <w:r>
-        <w:rPr>
-          <w:rFonts w:ascii="Calibri" w:hAnsi="Calibri" w:cs="Calibri"/>
-          <w:sz w:val="22"/>
-          <w:szCs w:val="22"/>
-        </w:rPr>
-        <w:t>etc</w:t>
-      </w:r>
-      <w:proofErr w:type="spellEnd"/>
-      <w:r>
-        <w:rPr>
-          <w:rFonts w:ascii="Calibri" w:hAnsi="Calibri" w:cs="Calibri"/>
-          <w:sz w:val="22"/>
-          <w:szCs w:val="22"/>
-        </w:rPr>
-        <w:t xml:space="preserve"> - basically</w:t>
+        <w:t xml:space="preserve">  &gt; rules I've told you about not modifying the source code in llm-device, etc - basically</w:t>
       </w:r>
     </w:p>
     <w:p>
@@ -249,78 +213,24 @@
           <w:sz w:val="22"/>
           <w:szCs w:val="22"/>
         </w:rPr>
-        <w:t xml:space="preserve">  &gt; If </w:t>
-      </w:r>
-      <w:proofErr w:type="spellStart"/>
-      <w:r>
-        <w:rPr>
-          <w:rFonts w:ascii="Calibri" w:hAnsi="Calibri" w:cs="Calibri"/>
-          <w:sz w:val="22"/>
-          <w:szCs w:val="22"/>
-        </w:rPr>
-        <w:t>llm</w:t>
-      </w:r>
-      <w:proofErr w:type="spellEnd"/>
-      <w:r>
-        <w:rPr>
-          <w:rFonts w:ascii="Calibri" w:hAnsi="Calibri" w:cs="Calibri"/>
-          <w:sz w:val="22"/>
-          <w:szCs w:val="22"/>
-        </w:rPr>
-        <w:t>-device folder doesn't exist yet, let's have it get that by doing "git clone</w:t>
-      </w:r>
-    </w:p>
-    <w:p>
-      <w:pPr>
-        <w:rPr>
-          <w:rFonts w:ascii="Calibri" w:hAnsi="Calibri" w:cs="Calibri"/>
-          <w:sz w:val="22"/>
-          <w:szCs w:val="22"/>
-        </w:rPr>
-      </w:pPr>
-      <w:r>
-        <w:rPr>
-          <w:rFonts w:ascii="Calibri" w:hAnsi="Calibri" w:cs="Calibri"/>
-          <w:sz w:val="22"/>
-          <w:szCs w:val="22"/>
-        </w:rPr>
-        <w:t xml:space="preserve">  &gt; </w:t>
-      </w:r>
-      <w:proofErr w:type="spellStart"/>
-      <w:r>
-        <w:rPr>
-          <w:rFonts w:ascii="Calibri" w:hAnsi="Calibri" w:cs="Calibri"/>
-          <w:sz w:val="22"/>
-          <w:szCs w:val="22"/>
-        </w:rPr>
-        <w:t>git@github.com:Genesis-AmSC-FES</w:t>
-      </w:r>
-      <w:proofErr w:type="spellEnd"/>
-      <w:r>
-        <w:rPr>
-          <w:rFonts w:ascii="Calibri" w:hAnsi="Calibri" w:cs="Calibri"/>
-          <w:sz w:val="22"/>
-          <w:szCs w:val="22"/>
-        </w:rPr>
-        <w:t>/</w:t>
-      </w:r>
-      <w:proofErr w:type="spellStart"/>
-      <w:r>
-        <w:rPr>
-          <w:rFonts w:ascii="Calibri" w:hAnsi="Calibri" w:cs="Calibri"/>
-          <w:sz w:val="22"/>
-          <w:szCs w:val="22"/>
-        </w:rPr>
-        <w:t>llm-device.git</w:t>
-      </w:r>
-      <w:proofErr w:type="spellEnd"/>
-      <w:r>
-        <w:rPr>
-          <w:rFonts w:ascii="Calibri" w:hAnsi="Calibri" w:cs="Calibri"/>
-          <w:sz w:val="22"/>
-          <w:szCs w:val="22"/>
-        </w:rPr>
-        <w:t>" (this will work because it will hopefully</w:t>
+        <w:t xml:space="preserve">  &gt; If llm-device folder doesn't exist yet, let's have it get that by doing "git clone</w:t>
+      </w:r>
+    </w:p>
+    <w:p>
+      <w:pPr>
+        <w:rPr>
+          <w:rFonts w:ascii="Calibri" w:hAnsi="Calibri" w:cs="Calibri"/>
+          <w:sz w:val="22"/>
+          <w:szCs w:val="22"/>
+        </w:rPr>
+      </w:pPr>
+      <w:r>
+        <w:rPr>
+          <w:rFonts w:ascii="Calibri" w:hAnsi="Calibri" w:cs="Calibri"/>
+          <w:sz w:val="22"/>
+          <w:szCs w:val="22"/>
+        </w:rPr>
+        <w:t xml:space="preserve">  &gt; git@github.com:Genesis-AmSC-FES/llm-device.git" (this will work because it will hopefully</w:t>
       </w:r>
     </w:p>
     <w:p>
@@ -578,6 +488,18 @@
     <w:p>
       <w:r>
         <w:t xml:space="preserve">  generic like "GPT5". I need that level of version detail in the stamp</w:t>
+      </w:r>
+    </w:p>
+    <w:p/>
+    <w:p/>
+    <w:p>
+      <w:r>
+        <w:t>› Maybe add some lines to the AGENT.md to, at the end of each step, re-read the instructions and make sure you've met all the goals of the step and followed the</w:t>
+      </w:r>
+    </w:p>
+    <w:p>
+      <w:r>
+        <w:t xml:space="preserve">  instructions properly before proceeding and calling the step finished? It's like a "Check your work"</w:t>
       </w:r>
     </w:p>
     <w:sectPr>

</xml_diff>